<commit_message>
Fill group 353501, journal number 8 and teacher Zhvakinа Anna Vasilievna
</commit_message>
<xml_diff>
--- a/IGI/KR1/KR1_Romeiko_Variant_8.docx
+++ b/IGI/KR1/KR1_Romeiko_Variant_8.docx
@@ -76,7 +76,7 @@
         <w:jc w:val="right"/>
       </w:pPr>
       <w:r>
-        <w:t>Выполнил студент группы __________________</w:t>
+        <w:t>Выполнил студент группы 353501</w:t>
       </w:r>
     </w:p>
     <w:p>
@@ -92,7 +92,7 @@
         <w:jc w:val="right"/>
       </w:pPr>
       <w:r>
-        <w:t>Номер в журнале __________________</w:t>
+        <w:t>Номер в журнале 8</w:t>
       </w:r>
     </w:p>
     <w:p>
@@ -100,7 +100,7 @@
         <w:jc w:val="right"/>
       </w:pPr>
       <w:r>
-        <w:t>Проверил __________________</w:t>
+        <w:t>Проверил Жвакина Анна Васильевна</w:t>
       </w:r>
     </w:p>
     <w:p/>
@@ -459,6 +459,11 @@
       </w:pPr>
       <w:r>
         <w:t>Задание 1 Индивидуальная структура</w:t>
+      </w:r>
+    </w:p>
+    <w:p>
+      <w:r>
+        <w:t>Базовая папка проекта - 353501_ROMEIKO_8, где 353501 - номер группы, ROMEIKO - фамилия, 8 - порядковый номер в журнале.</w:t>
       </w:r>
     </w:p>
     <w:p>

</xml_diff>

<commit_message>
Correct student group number to 353551
</commit_message>
<xml_diff>
--- a/IGI/KR1/KR1_Romeiko_Variant_8.docx
+++ b/IGI/KR1/KR1_Romeiko_Variant_8.docx
@@ -76,7 +76,7 @@
         <w:jc w:val="right"/>
       </w:pPr>
       <w:r>
-        <w:t>Выполнил студент группы 353501</w:t>
+        <w:t>Выполнил студент группы 353551</w:t>
       </w:r>
     </w:p>
     <w:p>
@@ -463,7 +463,7 @@
     </w:p>
     <w:p>
       <w:r>
-        <w:t>Базовая папка проекта - 353501_ROMEIKO_8, где 353501 - номер группы, ROMEIKO - фамилия, 8 - порядковый номер в журнале.</w:t>
+        <w:t>Базовая папка проекта - 353551_ROMEIKO_8, где 353551 - номер группы, ROMEIKO - фамилия, 8 - порядковый номер в журнале.</w:t>
       </w:r>
     </w:p>
     <w:p>

</xml_diff>

<commit_message>
Remove screenshot headers and figure captions from the report
</commit_message>
<xml_diff>
--- a/IGI/KR1/KR1_Romeiko_Variant_8.docx
+++ b/IGI/KR1/KR1_Romeiko_Variant_8.docx
@@ -408,7 +408,7 @@
       <w:r>
         <w:drawing>
           <wp:inline xmlns:a="http://schemas.openxmlformats.org/drawingml/2006/main" xmlns:pic="http://schemas.openxmlformats.org/drawingml/2006/picture">
-            <wp:extent cx="5940000" cy="3280922"/>
+            <wp:extent cx="5940000" cy="3016406"/>
             <wp:docPr id="1" name="Picture 1"/>
             <wp:cNvGraphicFramePr>
               <a:graphicFrameLocks noChangeAspect="1"/>
@@ -429,7 +429,7 @@
                   <pic:spPr>
                     <a:xfrm>
                       <a:off x="0" y="0"/>
-                      <a:ext cx="5940000" cy="3280922"/>
+                      <a:ext cx="5940000" cy="3016406"/>
                     </a:xfrm>
                     <a:prstGeom prst="rect"/>
                   </pic:spPr>
@@ -438,14 +438,6 @@
             </a:graphic>
           </wp:inline>
         </w:drawing>
-      </w:r>
-    </w:p>
-    <w:p>
-      <w:pPr>
-        <w:pStyle w:val="Caption"/>
-      </w:pPr>
-      <w:r>
-        <w:t>Рисунок 1. Журнал реального выполнения</w:t>
       </w:r>
     </w:p>
     <w:p>
@@ -480,7 +472,7 @@
       <w:r>
         <w:drawing>
           <wp:inline xmlns:a="http://schemas.openxmlformats.org/drawingml/2006/main" xmlns:pic="http://schemas.openxmlformats.org/drawingml/2006/picture">
-            <wp:extent cx="5940000" cy="4199766"/>
+            <wp:extent cx="5940000" cy="3935250"/>
             <wp:docPr id="2" name="Picture 2"/>
             <wp:cNvGraphicFramePr>
               <a:graphicFrameLocks noChangeAspect="1"/>
@@ -501,7 +493,7 @@
                   <pic:spPr>
                     <a:xfrm>
                       <a:off x="0" y="0"/>
-                      <a:ext cx="5940000" cy="4199766"/>
+                      <a:ext cx="5940000" cy="3935250"/>
                     </a:xfrm>
                     <a:prstGeom prst="rect"/>
                   </pic:spPr>
@@ -510,14 +502,6 @@
             </a:graphic>
           </wp:inline>
         </w:drawing>
-      </w:r>
-    </w:p>
-    <w:p>
-      <w:pPr>
-        <w:pStyle w:val="Caption"/>
-      </w:pPr>
-      <w:r>
-        <w:t>Рисунок 2. Структура варианта 8 и команды ее создания</w:t>
       </w:r>
     </w:p>
     <w:p>
@@ -542,7 +526,7 @@
       <w:r>
         <w:drawing>
           <wp:inline xmlns:a="http://schemas.openxmlformats.org/drawingml/2006/main" xmlns:pic="http://schemas.openxmlformats.org/drawingml/2006/picture">
-            <wp:extent cx="5940000" cy="1749516"/>
+            <wp:extent cx="5940000" cy="1485000"/>
             <wp:docPr id="3" name="Picture 3"/>
             <wp:cNvGraphicFramePr>
               <a:graphicFrameLocks noChangeAspect="1"/>
@@ -563,7 +547,7 @@
                   <pic:spPr>
                     <a:xfrm>
                       <a:off x="0" y="0"/>
-                      <a:ext cx="5940000" cy="1749516"/>
+                      <a:ext cx="5940000" cy="1485000"/>
                     </a:xfrm>
                     <a:prstGeom prst="rect"/>
                   </pic:spPr>
@@ -572,14 +556,6 @@
             </a:graphic>
           </wp:inline>
         </w:drawing>
-      </w:r>
-    </w:p>
-    <w:p>
-      <w:pPr>
-        <w:pStyle w:val="Caption"/>
-      </w:pPr>
-      <w:r>
-        <w:t>Рисунок 3. Журнал реального выполнения</w:t>
       </w:r>
     </w:p>
     <w:p>
@@ -604,7 +580,7 @@
       <w:r>
         <w:drawing>
           <wp:inline xmlns:a="http://schemas.openxmlformats.org/drawingml/2006/main" xmlns:pic="http://schemas.openxmlformats.org/drawingml/2006/picture">
-            <wp:extent cx="5940000" cy="4046625"/>
+            <wp:extent cx="5940000" cy="3782109"/>
             <wp:docPr id="4" name="Picture 4"/>
             <wp:cNvGraphicFramePr>
               <a:graphicFrameLocks noChangeAspect="1"/>
@@ -625,7 +601,7 @@
                   <pic:spPr>
                     <a:xfrm>
                       <a:off x="0" y="0"/>
-                      <a:ext cx="5940000" cy="4046625"/>
+                      <a:ext cx="5940000" cy="3782109"/>
                     </a:xfrm>
                     <a:prstGeom prst="rect"/>
                   </pic:spPr>
@@ -634,14 +610,6 @@
             </a:graphic>
           </wp:inline>
         </w:drawing>
-      </w:r>
-    </w:p>
-    <w:p>
-      <w:pPr>
-        <w:pStyle w:val="Caption"/>
-      </w:pPr>
-      <w:r>
-        <w:t>Рисунок 4. Журнал реального выполнения</w:t>
       </w:r>
     </w:p>
     <w:p>
@@ -666,7 +634,7 @@
       <w:r>
         <w:drawing>
           <wp:inline xmlns:a="http://schemas.openxmlformats.org/drawingml/2006/main" xmlns:pic="http://schemas.openxmlformats.org/drawingml/2006/picture">
-            <wp:extent cx="5940000" cy="4812328"/>
+            <wp:extent cx="5940000" cy="4547812"/>
             <wp:docPr id="5" name="Picture 5"/>
             <wp:cNvGraphicFramePr>
               <a:graphicFrameLocks noChangeAspect="1"/>
@@ -687,7 +655,7 @@
                   <pic:spPr>
                     <a:xfrm>
                       <a:off x="0" y="0"/>
-                      <a:ext cx="5940000" cy="4812328"/>
+                      <a:ext cx="5940000" cy="4547812"/>
                     </a:xfrm>
                     <a:prstGeom prst="rect"/>
                   </pic:spPr>
@@ -696,14 +664,6 @@
             </a:graphic>
           </wp:inline>
         </w:drawing>
-      </w:r>
-    </w:p>
-    <w:p>
-      <w:pPr>
-        <w:pStyle w:val="Caption"/>
-      </w:pPr>
-      <w:r>
-        <w:t>Рисунок 5. Журнал реального выполнения</w:t>
       </w:r>
     </w:p>
     <w:p>
@@ -728,7 +688,7 @@
       <w:r>
         <w:drawing>
           <wp:inline xmlns:a="http://schemas.openxmlformats.org/drawingml/2006/main" xmlns:pic="http://schemas.openxmlformats.org/drawingml/2006/picture">
-            <wp:extent cx="5940000" cy="3587203"/>
+            <wp:extent cx="5940000" cy="3322688"/>
             <wp:docPr id="6" name="Picture 6"/>
             <wp:cNvGraphicFramePr>
               <a:graphicFrameLocks noChangeAspect="1"/>
@@ -749,7 +709,7 @@
                   <pic:spPr>
                     <a:xfrm>
                       <a:off x="0" y="0"/>
-                      <a:ext cx="5940000" cy="3587203"/>
+                      <a:ext cx="5940000" cy="3322688"/>
                     </a:xfrm>
                     <a:prstGeom prst="rect"/>
                   </pic:spPr>
@@ -758,14 +718,6 @@
             </a:graphic>
           </wp:inline>
         </w:drawing>
-      </w:r>
-    </w:p>
-    <w:p>
-      <w:pPr>
-        <w:pStyle w:val="Caption"/>
-      </w:pPr>
-      <w:r>
-        <w:t>Рисунок 6. Журнал реального выполнения</w:t>
       </w:r>
     </w:p>
     <w:p>
@@ -790,7 +742,7 @@
       <w:r>
         <w:drawing>
           <wp:inline xmlns:a="http://schemas.openxmlformats.org/drawingml/2006/main" xmlns:pic="http://schemas.openxmlformats.org/drawingml/2006/picture">
-            <wp:extent cx="5940000" cy="4965469"/>
+            <wp:extent cx="5940000" cy="4700953"/>
             <wp:docPr id="7" name="Picture 7"/>
             <wp:cNvGraphicFramePr>
               <a:graphicFrameLocks noChangeAspect="1"/>
@@ -811,7 +763,7 @@
                   <pic:spPr>
                     <a:xfrm>
                       <a:off x="0" y="0"/>
-                      <a:ext cx="5940000" cy="4965469"/>
+                      <a:ext cx="5940000" cy="4700953"/>
                     </a:xfrm>
                     <a:prstGeom prst="rect"/>
                   </pic:spPr>
@@ -820,14 +772,6 @@
             </a:graphic>
           </wp:inline>
         </w:drawing>
-      </w:r>
-    </w:p>
-    <w:p>
-      <w:pPr>
-        <w:pStyle w:val="Caption"/>
-      </w:pPr>
-      <w:r>
-        <w:t>Рисунок 7. Журнал реального выполнения</w:t>
       </w:r>
     </w:p>
     <w:p>
@@ -852,7 +796,7 @@
       <w:r>
         <w:drawing>
           <wp:inline xmlns:a="http://schemas.openxmlformats.org/drawingml/2006/main" xmlns:pic="http://schemas.openxmlformats.org/drawingml/2006/picture">
-            <wp:extent cx="5940000" cy="3434062"/>
+            <wp:extent cx="5940000" cy="3169547"/>
             <wp:docPr id="8" name="Picture 8"/>
             <wp:cNvGraphicFramePr>
               <a:graphicFrameLocks noChangeAspect="1"/>
@@ -873,7 +817,7 @@
                   <pic:spPr>
                     <a:xfrm>
                       <a:off x="0" y="0"/>
-                      <a:ext cx="5940000" cy="3434062"/>
+                      <a:ext cx="5940000" cy="3169547"/>
                     </a:xfrm>
                     <a:prstGeom prst="rect"/>
                   </pic:spPr>
@@ -882,14 +826,6 @@
             </a:graphic>
           </wp:inline>
         </w:drawing>
-      </w:r>
-    </w:p>
-    <w:p>
-      <w:pPr>
-        <w:pStyle w:val="Caption"/>
-      </w:pPr>
-      <w:r>
-        <w:t>Рисунок 8. Журнал реального выполнения</w:t>
       </w:r>
     </w:p>
     <w:p>
@@ -914,7 +850,7 @@
       <w:r>
         <w:drawing>
           <wp:inline xmlns:a="http://schemas.openxmlformats.org/drawingml/2006/main" xmlns:pic="http://schemas.openxmlformats.org/drawingml/2006/picture">
-            <wp:extent cx="5940000" cy="4352906"/>
+            <wp:extent cx="5940000" cy="4088391"/>
             <wp:docPr id="9" name="Picture 9"/>
             <wp:cNvGraphicFramePr>
               <a:graphicFrameLocks noChangeAspect="1"/>
@@ -935,7 +871,7 @@
                   <pic:spPr>
                     <a:xfrm>
                       <a:off x="0" y="0"/>
-                      <a:ext cx="5940000" cy="4352906"/>
+                      <a:ext cx="5940000" cy="4088391"/>
                     </a:xfrm>
                     <a:prstGeom prst="rect"/>
                   </pic:spPr>
@@ -944,14 +880,6 @@
             </a:graphic>
           </wp:inline>
         </w:drawing>
-      </w:r>
-    </w:p>
-    <w:p>
-      <w:pPr>
-        <w:pStyle w:val="Caption"/>
-      </w:pPr>
-      <w:r>
-        <w:t>Рисунок 9. Журнал реального выполнения</w:t>
       </w:r>
     </w:p>
     <w:p>
@@ -976,7 +904,7 @@
       <w:r>
         <w:drawing>
           <wp:inline xmlns:a="http://schemas.openxmlformats.org/drawingml/2006/main" xmlns:pic="http://schemas.openxmlformats.org/drawingml/2006/picture">
-            <wp:extent cx="5940000" cy="4965469"/>
+            <wp:extent cx="5940000" cy="4700953"/>
             <wp:docPr id="10" name="Picture 10"/>
             <wp:cNvGraphicFramePr>
               <a:graphicFrameLocks noChangeAspect="1"/>
@@ -997,7 +925,7 @@
                   <pic:spPr>
                     <a:xfrm>
                       <a:off x="0" y="0"/>
-                      <a:ext cx="5940000" cy="4965469"/>
+                      <a:ext cx="5940000" cy="4700953"/>
                     </a:xfrm>
                     <a:prstGeom prst="rect"/>
                   </pic:spPr>
@@ -1006,14 +934,6 @@
             </a:graphic>
           </wp:inline>
         </w:drawing>
-      </w:r>
-    </w:p>
-    <w:p>
-      <w:pPr>
-        <w:pStyle w:val="Caption"/>
-      </w:pPr>
-      <w:r>
-        <w:t>Рисунок 10. Журнал реального выполнения</w:t>
       </w:r>
     </w:p>
     <w:p>
@@ -1038,7 +958,7 @@
       <w:r>
         <w:drawing>
           <wp:inline xmlns:a="http://schemas.openxmlformats.org/drawingml/2006/main" xmlns:pic="http://schemas.openxmlformats.org/drawingml/2006/picture">
-            <wp:extent cx="5940000" cy="4812328"/>
+            <wp:extent cx="5940000" cy="4547812"/>
             <wp:docPr id="11" name="Picture 11"/>
             <wp:cNvGraphicFramePr>
               <a:graphicFrameLocks noChangeAspect="1"/>
@@ -1059,7 +979,7 @@
                   <pic:spPr>
                     <a:xfrm>
                       <a:off x="0" y="0"/>
-                      <a:ext cx="5940000" cy="4812328"/>
+                      <a:ext cx="5940000" cy="4547812"/>
                     </a:xfrm>
                     <a:prstGeom prst="rect"/>
                   </pic:spPr>
@@ -1068,14 +988,6 @@
             </a:graphic>
           </wp:inline>
         </w:drawing>
-      </w:r>
-    </w:p>
-    <w:p>
-      <w:pPr>
-        <w:pStyle w:val="Caption"/>
-      </w:pPr>
-      <w:r>
-        <w:t>Рисунок 11. Журнал реального выполнения</w:t>
       </w:r>
     </w:p>
     <w:p>
@@ -1100,7 +1012,7 @@
       <w:r>
         <w:drawing>
           <wp:inline xmlns:a="http://schemas.openxmlformats.org/drawingml/2006/main" xmlns:pic="http://schemas.openxmlformats.org/drawingml/2006/picture">
-            <wp:extent cx="5940000" cy="2668359"/>
+            <wp:extent cx="5940000" cy="2403844"/>
             <wp:docPr id="12" name="Picture 12"/>
             <wp:cNvGraphicFramePr>
               <a:graphicFrameLocks noChangeAspect="1"/>
@@ -1121,7 +1033,7 @@
                   <pic:spPr>
                     <a:xfrm>
                       <a:off x="0" y="0"/>
-                      <a:ext cx="5940000" cy="2668359"/>
+                      <a:ext cx="5940000" cy="2403844"/>
                     </a:xfrm>
                     <a:prstGeom prst="rect"/>
                   </pic:spPr>
@@ -1130,14 +1042,6 @@
             </a:graphic>
           </wp:inline>
         </w:drawing>
-      </w:r>
-    </w:p>
-    <w:p>
-      <w:pPr>
-        <w:pStyle w:val="Caption"/>
-      </w:pPr>
-      <w:r>
-        <w:t>Рисунок 12. Журнал реального выполнения</w:t>
       </w:r>
     </w:p>
     <w:p>
@@ -1162,7 +1066,7 @@
       <w:r>
         <w:drawing>
           <wp:inline xmlns:a="http://schemas.openxmlformats.org/drawingml/2006/main" xmlns:pic="http://schemas.openxmlformats.org/drawingml/2006/picture">
-            <wp:extent cx="5940000" cy="4965469"/>
+            <wp:extent cx="5940000" cy="4700953"/>
             <wp:docPr id="13" name="Picture 13"/>
             <wp:cNvGraphicFramePr>
               <a:graphicFrameLocks noChangeAspect="1"/>
@@ -1183,7 +1087,7 @@
                   <pic:spPr>
                     <a:xfrm>
                       <a:off x="0" y="0"/>
-                      <a:ext cx="5940000" cy="4965469"/>
+                      <a:ext cx="5940000" cy="4700953"/>
                     </a:xfrm>
                     <a:prstGeom prst="rect"/>
                   </pic:spPr>
@@ -1192,14 +1096,6 @@
             </a:graphic>
           </wp:inline>
         </w:drawing>
-      </w:r>
-    </w:p>
-    <w:p>
-      <w:pPr>
-        <w:pStyle w:val="Caption"/>
-      </w:pPr>
-      <w:r>
-        <w:t>Рисунок 13. Журнал реального выполнения</w:t>
       </w:r>
     </w:p>
     <w:p>
@@ -1229,7 +1125,7 @@
       <w:r>
         <w:drawing>
           <wp:inline xmlns:a="http://schemas.openxmlformats.org/drawingml/2006/main" xmlns:pic="http://schemas.openxmlformats.org/drawingml/2006/picture">
-            <wp:extent cx="5940000" cy="3127781"/>
+            <wp:extent cx="5940000" cy="2863266"/>
             <wp:docPr id="14" name="Picture 14"/>
             <wp:cNvGraphicFramePr>
               <a:graphicFrameLocks noChangeAspect="1"/>
@@ -1250,7 +1146,7 @@
                   <pic:spPr>
                     <a:xfrm>
                       <a:off x="0" y="0"/>
-                      <a:ext cx="5940000" cy="3127781"/>
+                      <a:ext cx="5940000" cy="2863266"/>
                     </a:xfrm>
                     <a:prstGeom prst="rect"/>
                   </pic:spPr>
@@ -1259,14 +1155,6 @@
             </a:graphic>
           </wp:inline>
         </w:drawing>
-      </w:r>
-    </w:p>
-    <w:p>
-      <w:pPr>
-        <w:pStyle w:val="Caption"/>
-      </w:pPr>
-      <w:r>
-        <w:t>Рисунок 14. Журнал реального выполнения</w:t>
       </w:r>
     </w:p>
     <w:p>
@@ -1296,7 +1184,7 @@
       <w:r>
         <w:drawing>
           <wp:inline xmlns:a="http://schemas.openxmlformats.org/drawingml/2006/main" xmlns:pic="http://schemas.openxmlformats.org/drawingml/2006/picture">
-            <wp:extent cx="5940000" cy="4199766"/>
+            <wp:extent cx="5940000" cy="3935250"/>
             <wp:docPr id="15" name="Picture 15"/>
             <wp:cNvGraphicFramePr>
               <a:graphicFrameLocks noChangeAspect="1"/>
@@ -1317,7 +1205,7 @@
                   <pic:spPr>
                     <a:xfrm>
                       <a:off x="0" y="0"/>
-                      <a:ext cx="5940000" cy="4199766"/>
+                      <a:ext cx="5940000" cy="3935250"/>
                     </a:xfrm>
                     <a:prstGeom prst="rect"/>
                   </pic:spPr>
@@ -1326,14 +1214,6 @@
             </a:graphic>
           </wp:inline>
         </w:drawing>
-      </w:r>
-    </w:p>
-    <w:p>
-      <w:pPr>
-        <w:pStyle w:val="Caption"/>
-      </w:pPr>
-      <w:r>
-        <w:t>Рисунок 15. Журнал реального выполнения</w:t>
       </w:r>
     </w:p>
     <w:p>
@@ -1662,7 +1542,7 @@
       <w:r>
         <w:drawing>
           <wp:inline xmlns:a="http://schemas.openxmlformats.org/drawingml/2006/main" xmlns:pic="http://schemas.openxmlformats.org/drawingml/2006/picture">
-            <wp:extent cx="5940000" cy="4812328"/>
+            <wp:extent cx="5940000" cy="4547812"/>
             <wp:docPr id="16" name="Picture 16"/>
             <wp:cNvGraphicFramePr>
               <a:graphicFrameLocks noChangeAspect="1"/>
@@ -1683,7 +1563,7 @@
                   <pic:spPr>
                     <a:xfrm>
                       <a:off x="0" y="0"/>
-                      <a:ext cx="5940000" cy="4812328"/>
+                      <a:ext cx="5940000" cy="4547812"/>
                     </a:xfrm>
                     <a:prstGeom prst="rect"/>
                   </pic:spPr>
@@ -1692,14 +1572,6 @@
             </a:graphic>
           </wp:inline>
         </w:drawing>
-      </w:r>
-    </w:p>
-    <w:p>
-      <w:pPr>
-        <w:pStyle w:val="Caption"/>
-      </w:pPr>
-      <w:r>
-        <w:t>Рисунок 16. Исходный код подсчета цифр и декоратора</w:t>
       </w:r>
     </w:p>
     <w:p>
@@ -1724,7 +1596,7 @@
       <w:r>
         <w:drawing>
           <wp:inline xmlns:a="http://schemas.openxmlformats.org/drawingml/2006/main" xmlns:pic="http://schemas.openxmlformats.org/drawingml/2006/picture">
-            <wp:extent cx="5940000" cy="4965469"/>
+            <wp:extent cx="5940000" cy="4700953"/>
             <wp:docPr id="17" name="Picture 17"/>
             <wp:cNvGraphicFramePr>
               <a:graphicFrameLocks noChangeAspect="1"/>
@@ -1745,7 +1617,7 @@
                   <pic:spPr>
                     <a:xfrm>
                       <a:off x="0" y="0"/>
-                      <a:ext cx="5940000" cy="4965469"/>
+                      <a:ext cx="5940000" cy="4700953"/>
                     </a:xfrm>
                     <a:prstGeom prst="rect"/>
                   </pic:spPr>
@@ -1754,14 +1626,6 @@
             </a:graphic>
           </wp:inline>
         </w:drawing>
-      </w:r>
-    </w:p>
-    <w:p>
-      <w:pPr>
-        <w:pStyle w:val="Caption"/>
-      </w:pPr>
-      <w:r>
-        <w:t>Рисунок 17. Исходный код ввода и генератора</w:t>
       </w:r>
     </w:p>
     <w:p>
@@ -1786,7 +1650,7 @@
       <w:r>
         <w:drawing>
           <wp:inline xmlns:a="http://schemas.openxmlformats.org/drawingml/2006/main" xmlns:pic="http://schemas.openxmlformats.org/drawingml/2006/picture">
-            <wp:extent cx="5940000" cy="2821500"/>
+            <wp:extent cx="5940000" cy="2556984"/>
             <wp:docPr id="18" name="Picture 18"/>
             <wp:cNvGraphicFramePr>
               <a:graphicFrameLocks noChangeAspect="1"/>
@@ -1807,7 +1671,7 @@
                   <pic:spPr>
                     <a:xfrm>
                       <a:off x="0" y="0"/>
-                      <a:ext cx="5940000" cy="2821500"/>
+                      <a:ext cx="5940000" cy="2556984"/>
                     </a:xfrm>
                     <a:prstGeom prst="rect"/>
                   </pic:spPr>
@@ -1816,14 +1680,6 @@
             </a:graphic>
           </wp:inline>
         </w:drawing>
-      </w:r>
-    </w:p>
-    <w:p>
-      <w:pPr>
-        <w:pStyle w:val="Caption"/>
-      </w:pPr>
-      <w:r>
-        <w:t>Рисунок 18. Реальный запуск 2А с вводом и валидацией</w:t>
       </w:r>
     </w:p>
     <w:p>
@@ -1848,7 +1704,7 @@
       <w:r>
         <w:drawing>
           <wp:inline xmlns:a="http://schemas.openxmlformats.org/drawingml/2006/main" xmlns:pic="http://schemas.openxmlformats.org/drawingml/2006/picture">
-            <wp:extent cx="5940000" cy="2668359"/>
+            <wp:extent cx="5940000" cy="2403844"/>
             <wp:docPr id="19" name="Picture 19"/>
             <wp:cNvGraphicFramePr>
               <a:graphicFrameLocks noChangeAspect="1"/>
@@ -1869,7 +1725,7 @@
                   <pic:spPr>
                     <a:xfrm>
                       <a:off x="0" y="0"/>
-                      <a:ext cx="5940000" cy="2668359"/>
+                      <a:ext cx="5940000" cy="2403844"/>
                     </a:xfrm>
                     <a:prstGeom prst="rect"/>
                   </pic:spPr>
@@ -1878,14 +1734,6 @@
             </a:graphic>
           </wp:inline>
         </w:drawing>
-      </w:r>
-    </w:p>
-    <w:p>
-      <w:pPr>
-        <w:pStyle w:val="Caption"/>
-      </w:pPr>
-      <w:r>
-        <w:t>Рисунок 19. Реальный запуск 2А с генератором</w:t>
       </w:r>
     </w:p>
     <w:p>
@@ -1910,7 +1758,7 @@
       <w:r>
         <w:drawing>
           <wp:inline xmlns:a="http://schemas.openxmlformats.org/drawingml/2006/main" xmlns:pic="http://schemas.openxmlformats.org/drawingml/2006/picture">
-            <wp:extent cx="5940000" cy="5578031"/>
+            <wp:extent cx="5940000" cy="5313516"/>
             <wp:docPr id="20" name="Picture 20"/>
             <wp:cNvGraphicFramePr>
               <a:graphicFrameLocks noChangeAspect="1"/>
@@ -1931,7 +1779,7 @@
                   <pic:spPr>
                     <a:xfrm>
                       <a:off x="0" y="0"/>
-                      <a:ext cx="5940000" cy="5578031"/>
+                      <a:ext cx="5940000" cy="5313516"/>
                     </a:xfrm>
                     <a:prstGeom prst="rect"/>
                   </pic:spPr>
@@ -1940,14 +1788,6 @@
             </a:graphic>
           </wp:inline>
         </w:drawing>
-      </w:r>
-    </w:p>
-    <w:p>
-      <w:pPr>
-        <w:pStyle w:val="Caption"/>
-      </w:pPr>
-      <w:r>
-        <w:t>Рисунок 20. Регулярные выражения и индивидуальные функции</w:t>
       </w:r>
     </w:p>
     <w:p>
@@ -1977,7 +1817,7 @@
       <w:r>
         <w:drawing>
           <wp:inline xmlns:a="http://schemas.openxmlformats.org/drawingml/2006/main" xmlns:pic="http://schemas.openxmlformats.org/drawingml/2006/picture">
-            <wp:extent cx="5940000" cy="5118609"/>
+            <wp:extent cx="5940000" cy="4854094"/>
             <wp:docPr id="21" name="Picture 21"/>
             <wp:cNvGraphicFramePr>
               <a:graphicFrameLocks noChangeAspect="1"/>
@@ -1998,7 +1838,7 @@
                   <pic:spPr>
                     <a:xfrm>
                       <a:off x="0" y="0"/>
-                      <a:ext cx="5940000" cy="5118609"/>
+                      <a:ext cx="5940000" cy="4854094"/>
                     </a:xfrm>
                     <a:prstGeom prst="rect"/>
                   </pic:spPr>
@@ -2007,14 +1847,6 @@
             </a:graphic>
           </wp:inline>
         </w:drawing>
-      </w:r>
-    </w:p>
-    <w:p>
-      <w:pPr>
-        <w:pStyle w:val="Caption"/>
-      </w:pPr>
-      <w:r>
-        <w:t>Рисунок 21. Общая статистика текста</w:t>
       </w:r>
     </w:p>
     <w:p>
@@ -2039,7 +1871,7 @@
       <w:r>
         <w:drawing>
           <wp:inline xmlns:a="http://schemas.openxmlformats.org/drawingml/2006/main" xmlns:pic="http://schemas.openxmlformats.org/drawingml/2006/picture">
-            <wp:extent cx="5940000" cy="4812328"/>
+            <wp:extent cx="5940000" cy="4547812"/>
             <wp:docPr id="22" name="Picture 22"/>
             <wp:cNvGraphicFramePr>
               <a:graphicFrameLocks noChangeAspect="1"/>
@@ -2060,7 +1892,7 @@
                   <pic:spPr>
                     <a:xfrm>
                       <a:off x="0" y="0"/>
-                      <a:ext cx="5940000" cy="4812328"/>
+                      <a:ext cx="5940000" cy="4547812"/>
                     </a:xfrm>
                     <a:prstGeom prst="rect"/>
                   </pic:spPr>
@@ -2069,14 +1901,6 @@
             </a:graphic>
           </wp:inline>
         </w:drawing>
-      </w:r>
-    </w:p>
-    <w:p>
-      <w:pPr>
-        <w:pStyle w:val="Caption"/>
-      </w:pPr>
-      <w:r>
-        <w:t>Рисунок 22. Код архивирования и проверки файла</w:t>
       </w:r>
     </w:p>
     <w:p>
@@ -2101,7 +1925,7 @@
       <w:r>
         <w:drawing>
           <wp:inline xmlns:a="http://schemas.openxmlformats.org/drawingml/2006/main" xmlns:pic="http://schemas.openxmlformats.org/drawingml/2006/picture">
-            <wp:extent cx="5940000" cy="3587203"/>
+            <wp:extent cx="5940000" cy="3322688"/>
             <wp:docPr id="23" name="Picture 23"/>
             <wp:cNvGraphicFramePr>
               <a:graphicFrameLocks noChangeAspect="1"/>
@@ -2122,7 +1946,7 @@
                   <pic:spPr>
                     <a:xfrm>
                       <a:off x="0" y="0"/>
-                      <a:ext cx="5940000" cy="3587203"/>
+                      <a:ext cx="5940000" cy="3322688"/>
                     </a:xfrm>
                     <a:prstGeom prst="rect"/>
                   </pic:spPr>
@@ -2131,14 +1955,6 @@
             </a:graphic>
           </wp:inline>
         </w:drawing>
-      </w:r>
-    </w:p>
-    <w:p>
-      <w:pPr>
-        <w:pStyle w:val="Caption"/>
-      </w:pPr>
-      <w:r>
-        <w:t>Рисунок 23. Фактический исходный текст и сохраненный результат</w:t>
       </w:r>
     </w:p>
     <w:p>
@@ -2163,7 +1979,7 @@
       <w:r>
         <w:drawing>
           <wp:inline xmlns:a="http://schemas.openxmlformats.org/drawingml/2006/main" xmlns:pic="http://schemas.openxmlformats.org/drawingml/2006/picture">
-            <wp:extent cx="5940000" cy="2821500"/>
+            <wp:extent cx="5940000" cy="2556984"/>
             <wp:docPr id="24" name="Picture 24"/>
             <wp:cNvGraphicFramePr>
               <a:graphicFrameLocks noChangeAspect="1"/>
@@ -2184,7 +2000,7 @@
                   <pic:spPr>
                     <a:xfrm>
                       <a:off x="0" y="0"/>
-                      <a:ext cx="5940000" cy="2821500"/>
+                      <a:ext cx="5940000" cy="2556984"/>
                     </a:xfrm>
                     <a:prstGeom prst="rect"/>
                   </pic:spPr>
@@ -2193,14 +2009,6 @@
             </a:graphic>
           </wp:inline>
         </w:drawing>
-      </w:r>
-    </w:p>
-    <w:p>
-      <w:pPr>
-        <w:pStyle w:val="Caption"/>
-      </w:pPr>
-      <w:r>
-        <w:t>Рисунок 24. Метаданные файла из реального ZIP-архива</w:t>
       </w:r>
     </w:p>
     <w:p>
@@ -2230,7 +2038,7 @@
       <w:r>
         <w:drawing>
           <wp:inline xmlns:a="http://schemas.openxmlformats.org/drawingml/2006/main" xmlns:pic="http://schemas.openxmlformats.org/drawingml/2006/picture">
-            <wp:extent cx="5940000" cy="4659188"/>
+            <wp:extent cx="5940000" cy="4394672"/>
             <wp:docPr id="25" name="Picture 25"/>
             <wp:cNvGraphicFramePr>
               <a:graphicFrameLocks noChangeAspect="1"/>
@@ -2251,7 +2059,7 @@
                   <pic:spPr>
                     <a:xfrm>
                       <a:off x="0" y="0"/>
-                      <a:ext cx="5940000" cy="4659188"/>
+                      <a:ext cx="5940000" cy="4394672"/>
                     </a:xfrm>
                     <a:prstGeom prst="rect"/>
                   </pic:spPr>
@@ -2260,14 +2068,6 @@
             </a:graphic>
           </wp:inline>
         </w:drawing>
-      </w:r>
-    </w:p>
-    <w:p>
-      <w:pPr>
-        <w:pStyle w:val="Caption"/>
-      </w:pPr>
-      <w:r>
-        <w:t>Рисунок 25. Результат автоматических проверок и неверного ввода</w:t>
       </w:r>
     </w:p>
     <w:p>
@@ -2292,7 +2092,7 @@
       <w:r>
         <w:drawing>
           <wp:inline xmlns:a="http://schemas.openxmlformats.org/drawingml/2006/main" xmlns:pic="http://schemas.openxmlformats.org/drawingml/2006/picture">
-            <wp:extent cx="5940000" cy="4506047"/>
+            <wp:extent cx="5940000" cy="4241531"/>
             <wp:docPr id="26" name="Picture 26"/>
             <wp:cNvGraphicFramePr>
               <a:graphicFrameLocks noChangeAspect="1"/>
@@ -2313,7 +2113,7 @@
                   <pic:spPr>
                     <a:xfrm>
                       <a:off x="0" y="0"/>
-                      <a:ext cx="5940000" cy="4506047"/>
+                      <a:ext cx="5940000" cy="4241531"/>
                     </a:xfrm>
                     <a:prstGeom prst="rect"/>
                   </pic:spPr>
@@ -2322,14 +2122,6 @@
             </a:graphic>
           </wp:inline>
         </w:drawing>
-      </w:r>
-    </w:p>
-    <w:p>
-      <w:pPr>
-        <w:pStyle w:val="Caption"/>
-      </w:pPr>
-      <w:r>
-        <w:t>Рисунок 26. Dockerfile и фактическая сборка</w:t>
       </w:r>
     </w:p>
     <w:p>
@@ -2354,7 +2146,7 @@
       <w:r>
         <w:drawing>
           <wp:inline xmlns:a="http://schemas.openxmlformats.org/drawingml/2006/main" xmlns:pic="http://schemas.openxmlformats.org/drawingml/2006/picture">
-            <wp:extent cx="5940000" cy="3280922"/>
+            <wp:extent cx="5940000" cy="3016406"/>
             <wp:docPr id="27" name="Picture 27"/>
             <wp:cNvGraphicFramePr>
               <a:graphicFrameLocks noChangeAspect="1"/>
@@ -2375,7 +2167,7 @@
                   <pic:spPr>
                     <a:xfrm>
                       <a:off x="0" y="0"/>
-                      <a:ext cx="5940000" cy="3280922"/>
+                      <a:ext cx="5940000" cy="3016406"/>
                     </a:xfrm>
                     <a:prstGeom prst="rect"/>
                   </pic:spPr>
@@ -2384,14 +2176,6 @@
             </a:graphic>
           </wp:inline>
         </w:drawing>
-      </w:r>
-    </w:p>
-    <w:p>
-      <w:pPr>
-        <w:pStyle w:val="Caption"/>
-      </w:pPr>
-      <w:r>
-        <w:t>Рисунок 27. Журнал реального выполнения</w:t>
       </w:r>
     </w:p>
     <w:p>
@@ -2416,7 +2200,7 @@
       <w:r>
         <w:drawing>
           <wp:inline xmlns:a="http://schemas.openxmlformats.org/drawingml/2006/main" xmlns:pic="http://schemas.openxmlformats.org/drawingml/2006/picture">
-            <wp:extent cx="5940000" cy="5118609"/>
+            <wp:extent cx="5940000" cy="4854094"/>
             <wp:docPr id="28" name="Picture 28"/>
             <wp:cNvGraphicFramePr>
               <a:graphicFrameLocks noChangeAspect="1"/>
@@ -2437,7 +2221,7 @@
                   <pic:spPr>
                     <a:xfrm>
                       <a:off x="0" y="0"/>
-                      <a:ext cx="5940000" cy="5118609"/>
+                      <a:ext cx="5940000" cy="4854094"/>
                     </a:xfrm>
                     <a:prstGeom prst="rect"/>
                   </pic:spPr>
@@ -2446,14 +2230,6 @@
             </a:graphic>
           </wp:inline>
         </w:drawing>
-      </w:r>
-    </w:p>
-    <w:p>
-      <w:pPr>
-        <w:pStyle w:val="Caption"/>
-      </w:pPr>
-      <w:r>
-        <w:t>Рисунок 28. Журнал реального выполнения</w:t>
       </w:r>
     </w:p>
     <w:p>
@@ -2478,7 +2254,7 @@
       <w:r>
         <w:drawing>
           <wp:inline xmlns:a="http://schemas.openxmlformats.org/drawingml/2006/main" xmlns:pic="http://schemas.openxmlformats.org/drawingml/2006/picture">
-            <wp:extent cx="5940000" cy="4046625"/>
+            <wp:extent cx="5940000" cy="3782109"/>
             <wp:docPr id="29" name="Picture 29"/>
             <wp:cNvGraphicFramePr>
               <a:graphicFrameLocks noChangeAspect="1"/>
@@ -2499,7 +2275,7 @@
                   <pic:spPr>
                     <a:xfrm>
                       <a:off x="0" y="0"/>
-                      <a:ext cx="5940000" cy="4046625"/>
+                      <a:ext cx="5940000" cy="3782109"/>
                     </a:xfrm>
                     <a:prstGeom prst="rect"/>
                   </pic:spPr>
@@ -2508,14 +2284,6 @@
             </a:graphic>
           </wp:inline>
         </w:drawing>
-      </w:r>
-    </w:p>
-    <w:p>
-      <w:pPr>
-        <w:pStyle w:val="Caption"/>
-      </w:pPr>
-      <w:r>
-        <w:t>Рисунок 29. Журнал реального выполнения</w:t>
       </w:r>
     </w:p>
     <w:p>
@@ -2545,7 +2313,7 @@
       <w:r>
         <w:drawing>
           <wp:inline xmlns:a="http://schemas.openxmlformats.org/drawingml/2006/main" xmlns:pic="http://schemas.openxmlformats.org/drawingml/2006/picture">
-            <wp:extent cx="5940000" cy="2974641"/>
+            <wp:extent cx="5940000" cy="2710125"/>
             <wp:docPr id="30" name="Picture 30"/>
             <wp:cNvGraphicFramePr>
               <a:graphicFrameLocks noChangeAspect="1"/>
@@ -2566,7 +2334,7 @@
                   <pic:spPr>
                     <a:xfrm>
                       <a:off x="0" y="0"/>
-                      <a:ext cx="5940000" cy="2974641"/>
+                      <a:ext cx="5940000" cy="2710125"/>
                     </a:xfrm>
                     <a:prstGeom prst="rect"/>
                   </pic:spPr>
@@ -2575,14 +2343,6 @@
             </a:graphic>
           </wp:inline>
         </w:drawing>
-      </w:r>
-    </w:p>
-    <w:p>
-      <w:pPr>
-        <w:pStyle w:val="Caption"/>
-      </w:pPr>
-      <w:r>
-        <w:t>Рисунок 30. Абстрактная фигура и метод класса</w:t>
       </w:r>
     </w:p>
     <w:p>
@@ -2607,7 +2367,7 @@
       <w:r>
         <w:drawing>
           <wp:inline xmlns:a="http://schemas.openxmlformats.org/drawingml/2006/main" xmlns:pic="http://schemas.openxmlformats.org/drawingml/2006/picture">
-            <wp:extent cx="5940000" cy="4352906"/>
+            <wp:extent cx="5940000" cy="4088391"/>
             <wp:docPr id="31" name="Picture 31"/>
             <wp:cNvGraphicFramePr>
               <a:graphicFrameLocks noChangeAspect="1"/>
@@ -2628,7 +2388,7 @@
                   <pic:spPr>
                     <a:xfrm>
                       <a:off x="0" y="0"/>
-                      <a:ext cx="5940000" cy="4352906"/>
+                      <a:ext cx="5940000" cy="4088391"/>
                     </a:xfrm>
                     <a:prstGeom prst="rect"/>
                   </pic:spPr>
@@ -2637,14 +2397,6 @@
             </a:graphic>
           </wp:inline>
         </w:drawing>
-      </w:r>
-    </w:p>
-    <w:p>
-      <w:pPr>
-        <w:pStyle w:val="Caption"/>
-      </w:pPr>
-      <w:r>
-        <w:t>Рисунок 31. Класс FigureColor с property и валидацией</w:t>
       </w:r>
     </w:p>
     <w:p>
@@ -2674,7 +2426,7 @@
       <w:r>
         <w:drawing>
           <wp:inline xmlns:a="http://schemas.openxmlformats.org/drawingml/2006/main" xmlns:pic="http://schemas.openxmlformats.org/drawingml/2006/picture">
-            <wp:extent cx="5940000" cy="6190594"/>
+            <wp:extent cx="5940000" cy="5926078"/>
             <wp:docPr id="32" name="Picture 32"/>
             <wp:cNvGraphicFramePr>
               <a:graphicFrameLocks noChangeAspect="1"/>
@@ -2695,7 +2447,7 @@
                   <pic:spPr>
                     <a:xfrm>
                       <a:off x="0" y="0"/>
-                      <a:ext cx="5940000" cy="6190594"/>
+                      <a:ext cx="5940000" cy="5926078"/>
                     </a:xfrm>
                     <a:prstGeom prst="rect"/>
                   </pic:spPr>
@@ -2704,14 +2456,6 @@
             </a:graphic>
           </wp:inline>
         </w:drawing>
-      </w:r>
-    </w:p>
-    <w:p>
-      <w:pPr>
-        <w:pStyle w:val="Caption"/>
-      </w:pPr>
-      <w:r>
-        <w:t>Рисунок 32. Класс RegularPentagon и математические методы</w:t>
       </w:r>
     </w:p>
     <w:p>
@@ -2736,7 +2480,7 @@
       <w:r>
         <w:drawing>
           <wp:inline xmlns:a="http://schemas.openxmlformats.org/drawingml/2006/main" xmlns:pic="http://schemas.openxmlformats.org/drawingml/2006/picture">
-            <wp:extent cx="5940000" cy="5118609"/>
+            <wp:extent cx="5940000" cy="4854094"/>
             <wp:docPr id="33" name="Picture 33"/>
             <wp:cNvGraphicFramePr>
               <a:graphicFrameLocks noChangeAspect="1"/>
@@ -2757,7 +2501,7 @@
                   <pic:spPr>
                     <a:xfrm>
                       <a:off x="0" y="0"/>
-                      <a:ext cx="5940000" cy="5118609"/>
+                      <a:ext cx="5940000" cy="4854094"/>
                     </a:xfrm>
                     <a:prstGeom prst="rect"/>
                   </pic:spPr>
@@ -2766,14 +2510,6 @@
             </a:graphic>
           </wp:inline>
         </w:drawing>
-      </w:r>
-    </w:p>
-    <w:p>
-      <w:pPr>
-        <w:pStyle w:val="Caption"/>
-      </w:pPr>
-      <w:r>
-        <w:t>Рисунок 33. Код вывода фигуры на экран и в файл</w:t>
       </w:r>
     </w:p>
     <w:p>
@@ -2833,14 +2569,6 @@
             </a:graphic>
           </wp:inline>
         </w:drawing>
-      </w:r>
-    </w:p>
-    <w:p>
-      <w:pPr>
-        <w:pStyle w:val="Caption"/>
-      </w:pPr>
-      <w:r>
-        <w:t>Рисунок 34. Правильный пятиугольник со стороной 5.</w:t>
       </w:r>
     </w:p>
     <w:p>

</xml_diff>